<commit_message>
Cambios realizados para el nuevo modulo de promociones
</commit_message>
<xml_diff>
--- a/PlantillaProyecto V1 Estado del arte.docx
+++ b/PlantillaProyecto V1 Estado del arte.docx
@@ -4423,71 +4423,38 @@
     </w:p>
     <w:p>
       <w:pPr>
-        <w:rPr>
-          <w:lang w:val="es-CO"/>
-        </w:rPr>
-      </w:pPr>
-    </w:p>
-    <w:p>
-      <w:pPr>
-        <w:rPr>
-          <w:lang w:val="es-CO"/>
-        </w:rPr>
-      </w:pPr>
-      <w:r>
-        <w:rPr>
-          <w:noProof/>
-          <w:lang w:val="es-CO"/>
-        </w:rPr>
-        <w:drawing>
-          <wp:inline distT="0" distB="0" distL="0" distR="0" wp14:anchorId="01FD1076" wp14:editId="58566C7B">
-            <wp:extent cx="5545777" cy="5646420"/>
-            <wp:effectExtent l="0" t="0" r="0" b="0"/>
-            <wp:docPr id="1431206001" name="Imagen 6"/>
-            <wp:cNvGraphicFramePr>
-              <a:graphicFrameLocks xmlns:a="http://schemas.openxmlformats.org/drawingml/2006/main" noChangeAspect="1"/>
-            </wp:cNvGraphicFramePr>
-            <a:graphic xmlns:a="http://schemas.openxmlformats.org/drawingml/2006/main">
-              <a:graphicData uri="http://schemas.openxmlformats.org/drawingml/2006/picture">
-                <pic:pic xmlns:pic="http://schemas.openxmlformats.org/drawingml/2006/picture">
-                  <pic:nvPicPr>
-                    <pic:cNvPr id="0" name="Picture 23"/>
-                    <pic:cNvPicPr>
-                      <a:picLocks noChangeAspect="1" noChangeArrowheads="1"/>
-                    </pic:cNvPicPr>
-                  </pic:nvPicPr>
-                  <pic:blipFill>
-                    <a:blip r:embed="rId9" cstate="print">
-                      <a:extLst>
-                        <a:ext uri="{28A0092B-C50C-407E-A947-70E740481C1C}">
-                          <a14:useLocalDpi xmlns:a14="http://schemas.microsoft.com/office/drawing/2010/main" val="0"/>
-                        </a:ext>
-                      </a:extLst>
-                    </a:blip>
-                    <a:srcRect/>
-                    <a:stretch>
-                      <a:fillRect/>
-                    </a:stretch>
-                  </pic:blipFill>
-                  <pic:spPr bwMode="auto">
-                    <a:xfrm>
-                      <a:off x="0" y="0"/>
-                      <a:ext cx="5557206" cy="5658056"/>
-                    </a:xfrm>
-                    <a:prstGeom prst="rect">
-                      <a:avLst/>
-                    </a:prstGeom>
-                    <a:noFill/>
-                    <a:ln>
-                      <a:noFill/>
-                    </a:ln>
-                  </pic:spPr>
-                </pic:pic>
-              </a:graphicData>
-            </a:graphic>
-          </wp:inline>
-        </w:drawing>
-      </w:r>
+        <w:pStyle w:val="Ttulo1"/>
+        <w:rPr>
+          <w:lang w:val="es-CO"/>
+        </w:rPr>
+      </w:pPr>
+      <w:r>
+        <w:rPr>
+          <w:lang w:val="es-CO"/>
+        </w:rPr>
+        <w:lastRenderedPageBreak/>
+        <w:t>Marco conceptual y tecnológico</w:t>
+      </w:r>
+    </w:p>
+    <w:p>
+      <w:pPr>
+        <w:rPr>
+          <w:lang w:val="es-CO"/>
+        </w:rPr>
+      </w:pPr>
+      <w:r>
+        <w:rPr>
+          <w:lang w:val="es-CO"/>
+        </w:rPr>
+        <w:t>El desarrollo de una aplicación web para la gestión operativa de bares y discotecas requiere la utilización de conceptos, arquitecturas y tecnologías que permitan garantizar disponibilidad en red local, seguridad en el manejo de datos operativos, usabilidad en dispositivos móviles y mantenibilidad del sistema. En esta sección se presentan los principales fundamentos que orientarán el diseño y construcción de la solución propuesta.</w:t>
+      </w:r>
+    </w:p>
+    <w:p>
+      <w:pPr>
+        <w:rPr>
+          <w:lang w:val="es-CO"/>
+        </w:rPr>
+      </w:pPr>
     </w:p>
     <w:p>
       <w:pPr>
@@ -4569,7 +4536,7 @@
         </w:rPr>
         <w:t xml:space="preserve">. </w:t>
       </w:r>
-      <w:hyperlink r:id="rId10" w:tgtFrame="_blank" w:history="1">
+      <w:hyperlink r:id="rId9" w:tgtFrame="_blank" w:history="1">
         <w:r>
           <w:rPr>
             <w:rStyle w:val="Hipervnculo"/>
@@ -4605,7 +4572,7 @@
         </w:rPr>
         <w:t xml:space="preserve">. </w:t>
       </w:r>
-      <w:hyperlink r:id="rId11" w:tgtFrame="_blank" w:history="1">
+      <w:hyperlink r:id="rId10" w:tgtFrame="_blank" w:history="1">
         <w:r>
           <w:rPr>
             <w:rStyle w:val="Hipervnculo"/>
@@ -4649,7 +4616,7 @@
         </w:rPr>
         <w:t xml:space="preserve">. </w:t>
       </w:r>
-      <w:hyperlink r:id="rId12" w:tgtFrame="_blank" w:history="1">
+      <w:hyperlink r:id="rId11" w:tgtFrame="_blank" w:history="1">
         <w:r>
           <w:rPr>
             <w:rStyle w:val="Hipervnculo"/>
@@ -4727,7 +4694,7 @@
         </w:rPr>
         <w:t xml:space="preserve">. </w:t>
       </w:r>
-      <w:hyperlink r:id="rId13" w:tgtFrame="_blank" w:history="1">
+      <w:hyperlink r:id="rId12" w:tgtFrame="_blank" w:history="1">
         <w:r>
           <w:rPr>
             <w:rStyle w:val="Hipervnculo"/>
@@ -4763,7 +4730,7 @@
         </w:rPr>
         <w:t xml:space="preserve">. </w:t>
       </w:r>
-      <w:hyperlink r:id="rId14" w:tgtFrame="_blank" w:history="1">
+      <w:hyperlink r:id="rId13" w:tgtFrame="_blank" w:history="1">
         <w:r>
           <w:rPr>
             <w:rStyle w:val="Hipervnculo"/>
@@ -4817,7 +4784,7 @@
         </w:rPr>
         <w:t xml:space="preserve">. </w:t>
       </w:r>
-      <w:hyperlink r:id="rId15" w:tgtFrame="_blank" w:history="1">
+      <w:hyperlink r:id="rId14" w:tgtFrame="_blank" w:history="1">
         <w:r>
           <w:rPr>
             <w:rStyle w:val="Hipervnculo"/>
@@ -4897,7 +4864,7 @@
         </w:rPr>
         <w:t xml:space="preserve">. </w:t>
       </w:r>
-      <w:hyperlink r:id="rId16" w:tgtFrame="_blank" w:history="1">
+      <w:hyperlink r:id="rId15" w:tgtFrame="_blank" w:history="1">
         <w:r>
           <w:rPr>
             <w:rStyle w:val="Hipervnculo"/>
@@ -5023,7 +4990,7 @@
         </w:rPr>
         <w:t xml:space="preserve">. </w:t>
       </w:r>
-      <w:hyperlink r:id="rId17" w:tgtFrame="_blank" w:history="1">
+      <w:hyperlink r:id="rId16" w:tgtFrame="_blank" w:history="1">
         <w:r>
           <w:rPr>
             <w:rStyle w:val="Hipervnculo"/>
@@ -5086,7 +5053,7 @@
         <w:br/>
         <w:t xml:space="preserve">Fuente: </w:t>
       </w:r>
-      <w:hyperlink r:id="rId18" w:history="1">
+      <w:hyperlink r:id="rId17" w:history="1">
         <w:r>
           <w:rPr>
             <w:rStyle w:val="Hipervnculo"/>
@@ -5148,7 +5115,7 @@
         <w:br/>
         <w:t xml:space="preserve">Fuente: </w:t>
       </w:r>
-      <w:hyperlink r:id="rId19" w:history="1">
+      <w:hyperlink r:id="rId18" w:history="1">
         <w:r>
           <w:rPr>
             <w:rStyle w:val="Hipervnculo"/>
@@ -5192,7 +5159,7 @@
         <w:br/>
         <w:t xml:space="preserve">Fuente: </w:t>
       </w:r>
-      <w:hyperlink r:id="rId20" w:history="1">
+      <w:hyperlink r:id="rId19" w:history="1">
         <w:r>
           <w:rPr>
             <w:rStyle w:val="Hipervnculo"/>
@@ -5210,9 +5177,9 @@
       </w:pPr>
     </w:p>
     <w:sectPr>
-      <w:headerReference w:type="even" r:id="rId21"/>
-      <w:headerReference w:type="default" r:id="rId22"/>
-      <w:footerReference w:type="default" r:id="rId23"/>
+      <w:headerReference w:type="even" r:id="rId20"/>
+      <w:headerReference w:type="default" r:id="rId21"/>
+      <w:footerReference w:type="default" r:id="rId22"/>
       <w:pgSz w:w="12240" w:h="15840"/>
       <w:pgMar w:top="1440" w:right="1440" w:bottom="1440" w:left="1440" w:header="708" w:footer="708" w:gutter="0"/>
       <w:pgNumType w:start="1"/>
@@ -6907,6 +6874,7 @@
   <w:style w:type="character" w:default="1" w:styleId="Fuentedeprrafopredeter">
     <w:name w:val="Default Paragraph Font"/>
     <w:uiPriority w:val="1"/>
+    <w:semiHidden/>
     <w:unhideWhenUsed/>
   </w:style>
   <w:style w:type="table" w:default="1" w:styleId="Tablanormal">
@@ -7877,28 +7845,28 @@
 </file>
 
 <file path=customXml/item1.xml><?xml version="1.0" encoding="utf-8"?>
-<b:Sources xmlns:b="http://schemas.openxmlformats.org/officeDocument/2006/bibliography" xmlns="http://schemas.openxmlformats.org/officeDocument/2006/bibliography" SelectedStyle="\APASixthEditionOfficeOnline.xsl" StyleName="APA" Version="6"/>
-</file>
-
-<file path=customXml/item2.xml><?xml version="1.0" encoding="utf-8"?>
 <go:gDocsCustomXmlDataStorage xmlns:go="http://customooxmlschemas.google.com/" xmlns:r="http://schemas.openxmlformats.org/officeDocument/2006/relationships" uri="GoogleDocsCustomDataVersion2">
   <go:docsCustomData xmlns:go="http://customooxmlschemas.google.com/" roundtripDataSignature="AMtx7mi1KVMc6K/6znJM+6UXf5e0oirGlA==">CgMxLjAyCGguZ2pkZ3hzMgloLjMwajB6bGwyCWguMWZvYjl0ZTIJaC4zem55c2g3MgloLjJldDkycDAyCGgudHlqY3d0MgloLjNkeTZ2a20yCWguMXQzaDVzZjIJaC40ZDM0b2c4MgloLjJzOGV5bzEyCWguMTdkcDh2dTIJaC4zcmRjcmpuMgloLjI2aW4xcmcyCGgubG54Yno5MgloLjM1bmt1bjIyCWguMWtzdjR1djIJaC40NHNpbmlvMgloLjJqeHN4cWgyCGguejMzN3lhMgloLjNqMnFxbTM4AHIhMUdianNmazZwMlJhMG9odVBFN1c4OExLWEhKOXJYbHhY</go:docsCustomData>
 </go:gDocsCustomXmlDataStorage>
 </file>
 
-<file path=customXml/itemProps1.xml><?xml version="1.0" encoding="utf-8"?>
-<ds:datastoreItem xmlns:ds="http://schemas.openxmlformats.org/officeDocument/2006/customXml" ds:itemID="{148F234D-0088-4B12-8962-99F4469631FB}">
-  <ds:schemaRefs>
-    <ds:schemaRef ds:uri="http://schemas.openxmlformats.org/officeDocument/2006/bibliography"/>
-  </ds:schemaRefs>
-</ds:datastoreItem>
+<file path=customXml/item2.xml><?xml version="1.0" encoding="utf-8"?>
+<b:Sources xmlns:b="http://schemas.openxmlformats.org/officeDocument/2006/bibliography" xmlns="http://schemas.openxmlformats.org/officeDocument/2006/bibliography" SelectedStyle="\APASixthEditionOfficeOnline.xsl" StyleName="APA" Version="6"/>
 </file>
 
-<file path=customXml/itemProps2.xml><?xml version="1.0" encoding="utf-8"?>
+<file path=customXml/itemProps1.xml><?xml version="1.0" encoding="utf-8"?>
 <ds:datastoreItem xmlns:ds="http://schemas.openxmlformats.org/officeDocument/2006/customXml" ds:itemID="{11111111-1234-1234-1234-123412341234}">
   <ds:schemaRefs>
     <ds:schemaRef ds:uri="http://customooxmlschemas.google.com/"/>
     <ds:schemaRef ds:uri="http://schemas.openxmlformats.org/officeDocument/2006/relationships"/>
   </ds:schemaRefs>
 </ds:datastoreItem>
+</file>
+
+<file path=customXml/itemProps2.xml><?xml version="1.0" encoding="utf-8"?>
+<ds:datastoreItem xmlns:ds="http://schemas.openxmlformats.org/officeDocument/2006/customXml" ds:itemID="{148F234D-0088-4B12-8962-99F4469631FB}">
+  <ds:schemaRefs>
+    <ds:schemaRef ds:uri="http://schemas.openxmlformats.org/officeDocument/2006/bibliography"/>
+  </ds:schemaRefs>
+</ds:datastoreItem>
 </file>
</xml_diff>